<commit_message>
Agregar el enlace al repositorio y su estructura en el informe
La evaluacion pide adjuntar o enlazar las evidencias tecnicas (configuraciones,
scripts, repositorio, capturas y resultados), y el informe mencionaba el
repositorio sin dar la URL.

Co-Authored-By: Claude Opus 5 <noreply@anthropic.com>
</commit_message>
<xml_diff>
--- a/informe/Eval_U3_Cloud_Carrasco.docx
+++ b/informe/Eval_U3_Cloud_Carrasco.docx
@@ -2873,6 +2873,543 @@
         <w:t xml:space="preserve">Figura 3. Listado de documentos cargados. Al pie se indica la instancia del Scale Set que atendió la solicitud.</w:t>
       </w:r>
     </w:p>
+    <w:p>
+      <w:pPr>
+        <w:pStyle w:val="Heading2"/>
+        <w:spacing w:after="140" w:before="280"/>
+      </w:pPr>
+      <w:r>
+        <w:rPr>
+          <w:rFonts w:ascii="Arial" w:cs="Arial" w:eastAsia="Arial" w:hAnsi="Arial"/>
+          <w:b/>
+          <w:bCs/>
+          <w:color w:val="1B3A5C"/>
+          <w:sz w:val="26"/>
+          <w:szCs w:val="26"/>
+        </w:rPr>
+        <w:t xml:space="preserve">5.4 Repositorio del proyecto</w:t>
+      </w:r>
+    </w:p>
+    <w:p>
+      <w:pPr>
+        <w:spacing w:after="160" w:before="0" w:line="360" w:lineRule="auto"/>
+        <w:jc w:val="both"/>
+      </w:pPr>
+      <w:r>
+        <w:rPr>
+          <w:rFonts w:ascii="Arial" w:cs="Arial" w:eastAsia="Arial" w:hAnsi="Arial"/>
+          <w:sz w:val="24"/>
+          <w:szCs w:val="24"/>
+        </w:rPr>
+        <w:t xml:space="preserve">Todo el código de infraestructura, la aplicación, las pruebas y las evidencias recolectadas están disponibles en el siguiente repositorio público:</w:t>
+      </w:r>
+    </w:p>
+    <w:p>
+      <w:pPr>
+        <w:spacing w:after="200" w:before="100" w:line="360" w:lineRule="auto"/>
+        <w:jc w:val="center"/>
+      </w:pPr>
+      <w:hyperlink w:history="1" r:id="rIdzzyoud2ahsztber1p1cfk">
+        <w:r>
+          <w:rPr>
+            <w:rFonts w:ascii="Arial" w:cs="Arial" w:eastAsia="Arial" w:hAnsi="Arial"/>
+            <w:color w:val="0563C1"/>
+            <w:sz w:val="24"/>
+            <w:szCs w:val="24"/>
+            <w:u w:val="single"/>
+          </w:rPr>
+          <w:t xml:space="preserve">https://github.com/csilvaig1/eval3-gestor-documental</w:t>
+        </w:r>
+      </w:hyperlink>
+    </w:p>
+    <w:p>
+      <w:pPr>
+        <w:spacing w:after="160" w:before="0" w:line="360" w:lineRule="auto"/>
+        <w:jc w:val="both"/>
+      </w:pPr>
+      <w:r>
+        <w:rPr>
+          <w:rFonts w:ascii="Arial" w:cs="Arial" w:eastAsia="Arial" w:hAnsi="Arial"/>
+          <w:sz w:val="24"/>
+          <w:szCs w:val="24"/>
+        </w:rPr>
+        <w:t xml:space="preserve">La organización del repositorio es la siguiente:</w:t>
+      </w:r>
+    </w:p>
+    <w:tbl>
+      <w:tblPr>
+        <w:tblW w:type="dxa" w:w="9350"/>
+        <w:tblBorders>
+          <w:top w:val="single" w:color="auto" w:sz="4"/>
+          <w:left w:val="single" w:color="auto" w:sz="4"/>
+          <w:bottom w:val="single" w:color="auto" w:sz="4"/>
+          <w:right w:val="single" w:color="auto" w:sz="4"/>
+          <w:insideH w:val="single" w:color="auto" w:sz="4"/>
+          <w:insideV w:val="single" w:color="auto" w:sz="4"/>
+        </w:tblBorders>
+      </w:tblPr>
+      <w:tblGrid>
+        <w:gridCol w:w="2400"/>
+        <w:gridCol w:w="6950"/>
+      </w:tblGrid>
+      <w:tr>
+        <w:trPr>
+          <w:tblHeader/>
+        </w:trPr>
+        <w:tc>
+          <w:tcPr>
+            <w:tcW w:type="dxa" w:w="2400"/>
+            <w:shd w:fill="1B3A5C" w:val="clear"/>
+            <w:tcMar>
+              <w:top w:type="dxa" w:w="80"/>
+              <w:left w:type="dxa" w:w="100"/>
+              <w:bottom w:type="dxa" w:w="80"/>
+              <w:right w:type="dxa" w:w="100"/>
+            </w:tcMar>
+            <w:vAlign w:val="center"/>
+          </w:tcPr>
+          <w:p>
+            <w:pPr>
+              <w:spacing w:line="300" w:lineRule="auto"/>
+              <w:jc w:val="left"/>
+            </w:pPr>
+            <w:r>
+              <w:rPr>
+                <w:rFonts w:ascii="Arial" w:cs="Arial" w:eastAsia="Arial" w:hAnsi="Arial"/>
+                <w:b/>
+                <w:bCs/>
+                <w:color w:val="FFFFFF"/>
+                <w:sz w:val="20"/>
+                <w:szCs w:val="20"/>
+              </w:rPr>
+              <w:t xml:space="preserve">Directorio</w:t>
+            </w:r>
+          </w:p>
+        </w:tc>
+        <w:tc>
+          <w:tcPr>
+            <w:tcW w:type="dxa" w:w="6950"/>
+            <w:shd w:fill="1B3A5C" w:val="clear"/>
+            <w:tcMar>
+              <w:top w:type="dxa" w:w="80"/>
+              <w:left w:type="dxa" w:w="100"/>
+              <w:bottom w:type="dxa" w:w="80"/>
+              <w:right w:type="dxa" w:w="100"/>
+            </w:tcMar>
+            <w:vAlign w:val="center"/>
+          </w:tcPr>
+          <w:p>
+            <w:pPr>
+              <w:spacing w:line="300" w:lineRule="auto"/>
+              <w:jc w:val="left"/>
+            </w:pPr>
+            <w:r>
+              <w:rPr>
+                <w:rFonts w:ascii="Arial" w:cs="Arial" w:eastAsia="Arial" w:hAnsi="Arial"/>
+                <w:b/>
+                <w:bCs/>
+                <w:color w:val="FFFFFF"/>
+                <w:sz w:val="20"/>
+                <w:szCs w:val="20"/>
+              </w:rPr>
+              <w:t xml:space="preserve">Contenido</w:t>
+            </w:r>
+          </w:p>
+        </w:tc>
+      </w:tr>
+      <w:tr>
+        <w:tc>
+          <w:tcPr>
+            <w:tcW w:type="dxa" w:w="2400"/>
+            <w:tcMar>
+              <w:top w:type="dxa" w:w="80"/>
+              <w:left w:type="dxa" w:w="100"/>
+              <w:bottom w:type="dxa" w:w="80"/>
+              <w:right w:type="dxa" w:w="100"/>
+            </w:tcMar>
+            <w:vAlign w:val="center"/>
+          </w:tcPr>
+          <w:p>
+            <w:pPr>
+              <w:spacing w:line="300" w:lineRule="auto"/>
+              <w:jc w:val="left"/>
+            </w:pPr>
+            <w:r>
+              <w:rPr>
+                <w:rFonts w:ascii="Arial" w:cs="Arial" w:eastAsia="Arial" w:hAnsi="Arial"/>
+                <w:color w:val="000000"/>
+                <w:sz w:val="20"/>
+                <w:szCs w:val="20"/>
+              </w:rPr>
+              <w:t xml:space="preserve">terraform/</w:t>
+            </w:r>
+          </w:p>
+        </w:tc>
+        <w:tc>
+          <w:tcPr>
+            <w:tcW w:type="dxa" w:w="6950"/>
+            <w:tcMar>
+              <w:top w:type="dxa" w:w="80"/>
+              <w:left w:type="dxa" w:w="100"/>
+              <w:bottom w:type="dxa" w:w="80"/>
+              <w:right w:type="dxa" w:w="100"/>
+            </w:tcMar>
+            <w:vAlign w:val="center"/>
+          </w:tcPr>
+          <w:p>
+            <w:pPr>
+              <w:spacing w:line="300" w:lineRule="auto"/>
+              <w:jc w:val="left"/>
+            </w:pPr>
+            <w:r>
+              <w:rPr>
+                <w:rFonts w:ascii="Arial" w:cs="Arial" w:eastAsia="Arial" w:hAnsi="Arial"/>
+                <w:color w:val="000000"/>
+                <w:sz w:val="20"/>
+                <w:szCs w:val="20"/>
+              </w:rPr>
+              <w:t xml:space="preserve">Definición completa de la infraestructura como código (red, NSG, balanceador, Scale Set, autoescalado, almacenamiento y VM de servicios)</w:t>
+            </w:r>
+          </w:p>
+        </w:tc>
+      </w:tr>
+      <w:tr>
+        <w:tc>
+          <w:tcPr>
+            <w:tcW w:type="dxa" w:w="2400"/>
+            <w:tcMar>
+              <w:top w:type="dxa" w:w="80"/>
+              <w:left w:type="dxa" w:w="100"/>
+              <w:bottom w:type="dxa" w:w="80"/>
+              <w:right w:type="dxa" w:w="100"/>
+            </w:tcMar>
+            <w:vAlign w:val="center"/>
+          </w:tcPr>
+          <w:p>
+            <w:pPr>
+              <w:spacing w:line="300" w:lineRule="auto"/>
+              <w:jc w:val="left"/>
+            </w:pPr>
+            <w:r>
+              <w:rPr>
+                <w:rFonts w:ascii="Arial" w:cs="Arial" w:eastAsia="Arial" w:hAnsi="Arial"/>
+                <w:color w:val="000000"/>
+                <w:sz w:val="20"/>
+                <w:szCs w:val="20"/>
+              </w:rPr>
+              <w:t xml:space="preserve">ansible/</w:t>
+            </w:r>
+          </w:p>
+        </w:tc>
+        <w:tc>
+          <w:tcPr>
+            <w:tcW w:type="dxa" w:w="6950"/>
+            <w:tcMar>
+              <w:top w:type="dxa" w:w="80"/>
+              <w:left w:type="dxa" w:w="100"/>
+              <w:bottom w:type="dxa" w:w="80"/>
+              <w:right w:type="dxa" w:w="100"/>
+            </w:tcMar>
+            <w:vAlign w:val="center"/>
+          </w:tcPr>
+          <w:p>
+            <w:pPr>
+              <w:spacing w:line="300" w:lineRule="auto"/>
+              <w:jc w:val="left"/>
+            </w:pPr>
+            <w:r>
+              <w:rPr>
+                <w:rFonts w:ascii="Arial" w:cs="Arial" w:eastAsia="Arial" w:hAnsi="Arial"/>
+                <w:color w:val="000000"/>
+                <w:sz w:val="20"/>
+                <w:szCs w:val="20"/>
+              </w:rPr>
+              <w:t xml:space="preserve">Playbook de configuración de PostgreSQL, Prometheus y Grafana, reglas de alerta y panel de control como código</w:t>
+            </w:r>
+          </w:p>
+        </w:tc>
+      </w:tr>
+      <w:tr>
+        <w:tc>
+          <w:tcPr>
+            <w:tcW w:type="dxa" w:w="2400"/>
+            <w:tcMar>
+              <w:top w:type="dxa" w:w="80"/>
+              <w:left w:type="dxa" w:w="100"/>
+              <w:bottom w:type="dxa" w:w="80"/>
+              <w:right w:type="dxa" w:w="100"/>
+            </w:tcMar>
+            <w:vAlign w:val="center"/>
+          </w:tcPr>
+          <w:p>
+            <w:pPr>
+              <w:spacing w:line="300" w:lineRule="auto"/>
+              <w:jc w:val="left"/>
+            </w:pPr>
+            <w:r>
+              <w:rPr>
+                <w:rFonts w:ascii="Arial" w:cs="Arial" w:eastAsia="Arial" w:hAnsi="Arial"/>
+                <w:color w:val="000000"/>
+                <w:sz w:val="20"/>
+                <w:szCs w:val="20"/>
+              </w:rPr>
+              <w:t xml:space="preserve">app/</w:t>
+            </w:r>
+          </w:p>
+        </w:tc>
+        <w:tc>
+          <w:tcPr>
+            <w:tcW w:type="dxa" w:w="6950"/>
+            <w:tcMar>
+              <w:top w:type="dxa" w:w="80"/>
+              <w:left w:type="dxa" w:w="100"/>
+              <w:bottom w:type="dxa" w:w="80"/>
+              <w:right w:type="dxa" w:w="100"/>
+            </w:tcMar>
+            <w:vAlign w:val="center"/>
+          </w:tcPr>
+          <w:p>
+            <w:pPr>
+              <w:spacing w:line="300" w:lineRule="auto"/>
+              <w:jc w:val="left"/>
+            </w:pPr>
+            <w:r>
+              <w:rPr>
+                <w:rFonts w:ascii="Arial" w:cs="Arial" w:eastAsia="Arial" w:hAnsi="Arial"/>
+                <w:color w:val="000000"/>
+                <w:sz w:val="20"/>
+                <w:szCs w:val="20"/>
+              </w:rPr>
+              <w:t xml:space="preserve">Aplicación Flask del Gestor Documental (frontend, API y endpoints /health y /metrics)</w:t>
+            </w:r>
+          </w:p>
+        </w:tc>
+      </w:tr>
+      <w:tr>
+        <w:tc>
+          <w:tcPr>
+            <w:tcW w:type="dxa" w:w="2400"/>
+            <w:tcMar>
+              <w:top w:type="dxa" w:w="80"/>
+              <w:left w:type="dxa" w:w="100"/>
+              <w:bottom w:type="dxa" w:w="80"/>
+              <w:right w:type="dxa" w:w="100"/>
+            </w:tcMar>
+            <w:vAlign w:val="center"/>
+          </w:tcPr>
+          <w:p>
+            <w:pPr>
+              <w:spacing w:line="300" w:lineRule="auto"/>
+              <w:jc w:val="left"/>
+            </w:pPr>
+            <w:r>
+              <w:rPr>
+                <w:rFonts w:ascii="Arial" w:cs="Arial" w:eastAsia="Arial" w:hAnsi="Arial"/>
+                <w:color w:val="000000"/>
+                <w:sz w:val="20"/>
+                <w:szCs w:val="20"/>
+              </w:rPr>
+              <w:t xml:space="preserve">pruebas/selenium/</w:t>
+            </w:r>
+          </w:p>
+        </w:tc>
+        <w:tc>
+          <w:tcPr>
+            <w:tcW w:type="dxa" w:w="6950"/>
+            <w:tcMar>
+              <w:top w:type="dxa" w:w="80"/>
+              <w:left w:type="dxa" w:w="100"/>
+              <w:bottom w:type="dxa" w:w="80"/>
+              <w:right w:type="dxa" w:w="100"/>
+            </w:tcMar>
+            <w:vAlign w:val="center"/>
+          </w:tcPr>
+          <w:p>
+            <w:pPr>
+              <w:spacing w:line="300" w:lineRule="auto"/>
+              <w:jc w:val="left"/>
+            </w:pPr>
+            <w:r>
+              <w:rPr>
+                <w:rFonts w:ascii="Arial" w:cs="Arial" w:eastAsia="Arial" w:hAnsi="Arial"/>
+                <w:color w:val="000000"/>
+                <w:sz w:val="20"/>
+                <w:szCs w:val="20"/>
+              </w:rPr>
+              <w:t xml:space="preserve">Suite de pruebas funcionales automatizadas (casos CP-01 a CP-06)</w:t>
+            </w:r>
+          </w:p>
+        </w:tc>
+      </w:tr>
+      <w:tr>
+        <w:tc>
+          <w:tcPr>
+            <w:tcW w:type="dxa" w:w="2400"/>
+            <w:tcMar>
+              <w:top w:type="dxa" w:w="80"/>
+              <w:left w:type="dxa" w:w="100"/>
+              <w:bottom w:type="dxa" w:w="80"/>
+              <w:right w:type="dxa" w:w="100"/>
+            </w:tcMar>
+            <w:vAlign w:val="center"/>
+          </w:tcPr>
+          <w:p>
+            <w:pPr>
+              <w:spacing w:line="300" w:lineRule="auto"/>
+              <w:jc w:val="left"/>
+            </w:pPr>
+            <w:r>
+              <w:rPr>
+                <w:rFonts w:ascii="Arial" w:cs="Arial" w:eastAsia="Arial" w:hAnsi="Arial"/>
+                <w:color w:val="000000"/>
+                <w:sz w:val="20"/>
+                <w:szCs w:val="20"/>
+              </w:rPr>
+              <w:t xml:space="preserve">pruebas/carga/</w:t>
+            </w:r>
+          </w:p>
+        </w:tc>
+        <w:tc>
+          <w:tcPr>
+            <w:tcW w:type="dxa" w:w="6950"/>
+            <w:tcMar>
+              <w:top w:type="dxa" w:w="80"/>
+              <w:left w:type="dxa" w:w="100"/>
+              <w:bottom w:type="dxa" w:w="80"/>
+              <w:right w:type="dxa" w:w="100"/>
+            </w:tcMar>
+            <w:vAlign w:val="center"/>
+          </w:tcPr>
+          <w:p>
+            <w:pPr>
+              <w:spacing w:line="300" w:lineRule="auto"/>
+              <w:jc w:val="left"/>
+            </w:pPr>
+            <w:r>
+              <w:rPr>
+                <w:rFonts w:ascii="Arial" w:cs="Arial" w:eastAsia="Arial" w:hAnsi="Arial"/>
+                <w:color w:val="000000"/>
+                <w:sz w:val="20"/>
+                <w:szCs w:val="20"/>
+              </w:rPr>
+              <w:t xml:space="preserve">Generador de carga concurrente usado en la prueba de rendimiento</w:t>
+            </w:r>
+          </w:p>
+        </w:tc>
+      </w:tr>
+      <w:tr>
+        <w:tc>
+          <w:tcPr>
+            <w:tcW w:type="dxa" w:w="2400"/>
+            <w:tcMar>
+              <w:top w:type="dxa" w:w="80"/>
+              <w:left w:type="dxa" w:w="100"/>
+              <w:bottom w:type="dxa" w:w="80"/>
+              <w:right w:type="dxa" w:w="100"/>
+            </w:tcMar>
+            <w:vAlign w:val="center"/>
+          </w:tcPr>
+          <w:p>
+            <w:pPr>
+              <w:spacing w:line="300" w:lineRule="auto"/>
+              <w:jc w:val="left"/>
+            </w:pPr>
+            <w:r>
+              <w:rPr>
+                <w:rFonts w:ascii="Arial" w:cs="Arial" w:eastAsia="Arial" w:hAnsi="Arial"/>
+                <w:color w:val="000000"/>
+                <w:sz w:val="20"/>
+                <w:szCs w:val="20"/>
+              </w:rPr>
+              <w:t xml:space="preserve">evidencias/</w:t>
+            </w:r>
+          </w:p>
+        </w:tc>
+        <w:tc>
+          <w:tcPr>
+            <w:tcW w:type="dxa" w:w="6950"/>
+            <w:tcMar>
+              <w:top w:type="dxa" w:w="80"/>
+              <w:left w:type="dxa" w:w="100"/>
+              <w:bottom w:type="dxa" w:w="80"/>
+              <w:right w:type="dxa" w:w="100"/>
+            </w:tcMar>
+            <w:vAlign w:val="center"/>
+          </w:tcPr>
+          <w:p>
+            <w:pPr>
+              <w:spacing w:line="300" w:lineRule="auto"/>
+              <w:jc w:val="left"/>
+            </w:pPr>
+            <w:r>
+              <w:rPr>
+                <w:rFonts w:ascii="Arial" w:cs="Arial" w:eastAsia="Arial" w:hAnsi="Arial"/>
+                <w:color w:val="000000"/>
+                <w:sz w:val="20"/>
+                <w:szCs w:val="20"/>
+              </w:rPr>
+              <w:t xml:space="preserve">Registros de la prueba de falla controlada, de la prueba de carga, del autoescalado, reporte de Selenium y capturas de pantalla</w:t>
+            </w:r>
+          </w:p>
+        </w:tc>
+      </w:tr>
+      <w:tr>
+        <w:tc>
+          <w:tcPr>
+            <w:tcW w:type="dxa" w:w="2400"/>
+            <w:tcMar>
+              <w:top w:type="dxa" w:w="80"/>
+              <w:left w:type="dxa" w:w="100"/>
+              <w:bottom w:type="dxa" w:w="80"/>
+              <w:right w:type="dxa" w:w="100"/>
+            </w:tcMar>
+            <w:vAlign w:val="center"/>
+          </w:tcPr>
+          <w:p>
+            <w:pPr>
+              <w:spacing w:line="300" w:lineRule="auto"/>
+              <w:jc w:val="left"/>
+            </w:pPr>
+            <w:r>
+              <w:rPr>
+                <w:rFonts w:ascii="Arial" w:cs="Arial" w:eastAsia="Arial" w:hAnsi="Arial"/>
+                <w:color w:val="000000"/>
+                <w:sz w:val="20"/>
+                <w:szCs w:val="20"/>
+              </w:rPr>
+              <w:t xml:space="preserve">informe/</w:t>
+            </w:r>
+          </w:p>
+        </w:tc>
+        <w:tc>
+          <w:tcPr>
+            <w:tcW w:type="dxa" w:w="6950"/>
+            <w:tcMar>
+              <w:top w:type="dxa" w:w="80"/>
+              <w:left w:type="dxa" w:w="100"/>
+              <w:bottom w:type="dxa" w:w="80"/>
+              <w:right w:type="dxa" w:w="100"/>
+            </w:tcMar>
+            <w:vAlign w:val="center"/>
+          </w:tcPr>
+          <w:p>
+            <w:pPr>
+              <w:spacing w:line="300" w:lineRule="auto"/>
+              <w:jc w:val="left"/>
+            </w:pPr>
+            <w:r>
+              <w:rPr>
+                <w:rFonts w:ascii="Arial" w:cs="Arial" w:eastAsia="Arial" w:hAnsi="Arial"/>
+                <w:color w:val="000000"/>
+                <w:sz w:val="20"/>
+                <w:szCs w:val="20"/>
+              </w:rPr>
+              <w:t xml:space="preserve">Este documento, el diagrama de arquitectura y los scripts que los generan</w:t>
+            </w:r>
+          </w:p>
+        </w:tc>
+      </w:tr>
+    </w:tbl>
     <w:p>
       <w:pPr>
         <w:pStyle w:val="Heading1"/>

</xml_diff>